<commit_message>
docs: agregar controles ISO/IEC 27001 aplicables al CRUD basico
A.8.28 (codificacion segura: validacion de entrada y Stored Procedures
parametrizados) en Crear/Editar, y A.5.33 (proteccion de registros:
nota firmada inmutable) en Firmar. Sin roles ni Usuario todavia;
control de acceso, autenticacion y auditoria quedan para cuando se
incorporen.

Co-Authored-By: Claude Sonnet 5 <noreply@anthropic.com>
</commit_message>
<xml_diff>
--- a/Informe_Tecnico_SistemaNotasClinicas_Final.docx
+++ b/Informe_Tecnico_SistemaNotasClinicas_Final.docx
@@ -167,7 +167,7 @@
         <w:spacing w:after="150" w:before="300"/>
       </w:pPr>
       <w:r>
-        <w:t xml:space="preserve">3. Requerimientos (CRUD básico)</w:t>
+        <w:t xml:space="preserve">3. Requerimientos (CRUD básico + ISO/IEC 27001)</w:t>
       </w:r>
     </w:p>
     <w:tbl>
@@ -183,14 +183,15 @@
         </w:tblBorders>
       </w:tblPr>
       <w:tblGrid>
-        <w:gridCol w:w="900"/>
-        <w:gridCol w:w="1800"/>
-        <w:gridCol w:w="6300"/>
+        <w:gridCol w:w="700"/>
+        <w:gridCol w:w="1400"/>
+        <w:gridCol w:w="5600"/>
+        <w:gridCol w:w="1300"/>
       </w:tblGrid>
       <w:tr>
         <w:tc>
           <w:tcPr>
-            <w:tcW w:type="dxa" w:w="900"/>
+            <w:tcW w:type="dxa" w:w="700"/>
             <w:shd w:fill="D9E2F3" w:val="clear"/>
           </w:tcPr>
           <w:p>
@@ -207,7 +208,7 @@
         </w:tc>
         <w:tc>
           <w:tcPr>
-            <w:tcW w:type="dxa" w:w="1800"/>
+            <w:tcW w:type="dxa" w:w="1400"/>
             <w:shd w:fill="D9E2F3" w:val="clear"/>
           </w:tcPr>
           <w:p>
@@ -224,7 +225,7 @@
         </w:tc>
         <w:tc>
           <w:tcPr>
-            <w:tcW w:type="dxa" w:w="6300"/>
+            <w:tcW w:type="dxa" w:w="5600"/>
             <w:shd w:fill="D9E2F3" w:val="clear"/>
           </w:tcPr>
           <w:p>
@@ -239,11 +240,28 @@
             </w:r>
           </w:p>
         </w:tc>
-      </w:tr>
-      <w:tr>
-        <w:tc>
-          <w:tcPr>
-            <w:tcW w:type="dxa" w:w="900"/>
+        <w:tc>
+          <w:tcPr>
+            <w:tcW w:type="dxa" w:w="1300"/>
+            <w:shd w:fill="D9E2F3" w:val="clear"/>
+          </w:tcPr>
+          <w:p>
+            <w:r>
+              <w:rPr>
+                <w:b/>
+                <w:bCs/>
+                <w:sz w:val="19"/>
+                <w:szCs w:val="19"/>
+              </w:rPr>
+              <w:t xml:space="preserve">ISO 27001</w:t>
+            </w:r>
+          </w:p>
+        </w:tc>
+      </w:tr>
+      <w:tr>
+        <w:tc>
+          <w:tcPr>
+            <w:tcW w:type="dxa" w:w="700"/>
           </w:tcPr>
           <w:p>
             <w:r>
@@ -259,7 +277,7 @@
         </w:tc>
         <w:tc>
           <w:tcPr>
-            <w:tcW w:type="dxa" w:w="1800"/>
+            <w:tcW w:type="dxa" w:w="1400"/>
           </w:tcPr>
           <w:p>
             <w:r>
@@ -275,7 +293,7 @@
         </w:tc>
         <w:tc>
           <w:tcPr>
-            <w:tcW w:type="dxa" w:w="6300"/>
+            <w:tcW w:type="dxa" w:w="5600"/>
           </w:tcPr>
           <w:p>
             <w:r>
@@ -289,11 +307,27 @@
             </w:r>
           </w:p>
         </w:tc>
-      </w:tr>
-      <w:tr>
-        <w:tc>
-          <w:tcPr>
-            <w:tcW w:type="dxa" w:w="900"/>
+        <w:tc>
+          <w:tcPr>
+            <w:tcW w:type="dxa" w:w="1300"/>
+          </w:tcPr>
+          <w:p>
+            <w:r>
+              <w:rPr>
+                <w:b w:val="false"/>
+                <w:bCs w:val="false"/>
+                <w:sz w:val="19"/>
+                <w:szCs w:val="19"/>
+              </w:rPr>
+              <w:t xml:space="preserve">A.8.28</w:t>
+            </w:r>
+          </w:p>
+        </w:tc>
+      </w:tr>
+      <w:tr>
+        <w:tc>
+          <w:tcPr>
+            <w:tcW w:type="dxa" w:w="700"/>
           </w:tcPr>
           <w:p>
             <w:r>
@@ -309,7 +343,7 @@
         </w:tc>
         <w:tc>
           <w:tcPr>
-            <w:tcW w:type="dxa" w:w="1800"/>
+            <w:tcW w:type="dxa" w:w="1400"/>
           </w:tcPr>
           <w:p>
             <w:r>
@@ -325,7 +359,7 @@
         </w:tc>
         <w:tc>
           <w:tcPr>
-            <w:tcW w:type="dxa" w:w="6300"/>
+            <w:tcW w:type="dxa" w:w="5600"/>
           </w:tcPr>
           <w:p>
             <w:r>
@@ -339,11 +373,27 @@
             </w:r>
           </w:p>
         </w:tc>
-      </w:tr>
-      <w:tr>
-        <w:tc>
-          <w:tcPr>
-            <w:tcW w:type="dxa" w:w="900"/>
+        <w:tc>
+          <w:tcPr>
+            <w:tcW w:type="dxa" w:w="1300"/>
+          </w:tcPr>
+          <w:p>
+            <w:r>
+              <w:rPr>
+                <w:b w:val="false"/>
+                <w:bCs w:val="false"/>
+                <w:sz w:val="19"/>
+                <w:szCs w:val="19"/>
+              </w:rPr>
+              <w:t xml:space="preserve">-</w:t>
+            </w:r>
+          </w:p>
+        </w:tc>
+      </w:tr>
+      <w:tr>
+        <w:tc>
+          <w:tcPr>
+            <w:tcW w:type="dxa" w:w="700"/>
           </w:tcPr>
           <w:p>
             <w:r>
@@ -359,7 +409,7 @@
         </w:tc>
         <w:tc>
           <w:tcPr>
-            <w:tcW w:type="dxa" w:w="1800"/>
+            <w:tcW w:type="dxa" w:w="1400"/>
           </w:tcPr>
           <w:p>
             <w:r>
@@ -375,7 +425,7 @@
         </w:tc>
         <w:tc>
           <w:tcPr>
-            <w:tcW w:type="dxa" w:w="6300"/>
+            <w:tcW w:type="dxa" w:w="5600"/>
           </w:tcPr>
           <w:p>
             <w:r>
@@ -389,11 +439,27 @@
             </w:r>
           </w:p>
         </w:tc>
-      </w:tr>
-      <w:tr>
-        <w:tc>
-          <w:tcPr>
-            <w:tcW w:type="dxa" w:w="900"/>
+        <w:tc>
+          <w:tcPr>
+            <w:tcW w:type="dxa" w:w="1300"/>
+          </w:tcPr>
+          <w:p>
+            <w:r>
+              <w:rPr>
+                <w:b w:val="false"/>
+                <w:bCs w:val="false"/>
+                <w:sz w:val="19"/>
+                <w:szCs w:val="19"/>
+              </w:rPr>
+              <w:t xml:space="preserve">A.8.28</w:t>
+            </w:r>
+          </w:p>
+        </w:tc>
+      </w:tr>
+      <w:tr>
+        <w:tc>
+          <w:tcPr>
+            <w:tcW w:type="dxa" w:w="700"/>
           </w:tcPr>
           <w:p>
             <w:r>
@@ -409,7 +475,7 @@
         </w:tc>
         <w:tc>
           <w:tcPr>
-            <w:tcW w:type="dxa" w:w="1800"/>
+            <w:tcW w:type="dxa" w:w="1400"/>
           </w:tcPr>
           <w:p>
             <w:r>
@@ -425,7 +491,7 @@
         </w:tc>
         <w:tc>
           <w:tcPr>
-            <w:tcW w:type="dxa" w:w="6300"/>
+            <w:tcW w:type="dxa" w:w="5600"/>
           </w:tcPr>
           <w:p>
             <w:r>
@@ -439,11 +505,27 @@
             </w:r>
           </w:p>
         </w:tc>
-      </w:tr>
-      <w:tr>
-        <w:tc>
-          <w:tcPr>
-            <w:tcW w:type="dxa" w:w="900"/>
+        <w:tc>
+          <w:tcPr>
+            <w:tcW w:type="dxa" w:w="1300"/>
+          </w:tcPr>
+          <w:p>
+            <w:r>
+              <w:rPr>
+                <w:b w:val="false"/>
+                <w:bCs w:val="false"/>
+                <w:sz w:val="19"/>
+                <w:szCs w:val="19"/>
+              </w:rPr>
+              <w:t xml:space="preserve">-</w:t>
+            </w:r>
+          </w:p>
+        </w:tc>
+      </w:tr>
+      <w:tr>
+        <w:tc>
+          <w:tcPr>
+            <w:tcW w:type="dxa" w:w="700"/>
           </w:tcPr>
           <w:p>
             <w:r>
@@ -459,7 +541,7 @@
         </w:tc>
         <w:tc>
           <w:tcPr>
-            <w:tcW w:type="dxa" w:w="1800"/>
+            <w:tcW w:type="dxa" w:w="1400"/>
           </w:tcPr>
           <w:p>
             <w:r>
@@ -475,7 +557,7 @@
         </w:tc>
         <w:tc>
           <w:tcPr>
-            <w:tcW w:type="dxa" w:w="6300"/>
+            <w:tcW w:type="dxa" w:w="5600"/>
           </w:tcPr>
           <w:p>
             <w:r>
@@ -489,6 +571,22 @@
             </w:r>
           </w:p>
         </w:tc>
+        <w:tc>
+          <w:tcPr>
+            <w:tcW w:type="dxa" w:w="1300"/>
+          </w:tcPr>
+          <w:p>
+            <w:r>
+              <w:rPr>
+                <w:b w:val="false"/>
+                <w:bCs w:val="false"/>
+                <w:sz w:val="19"/>
+                <w:szCs w:val="19"/>
+              </w:rPr>
+              <w:t xml:space="preserve">A.5.33</w:t>
+            </w:r>
+          </w:p>
+        </w:tc>
       </w:tr>
     </w:tbl>
     <w:p>
@@ -502,6 +600,199 @@
       </w:pPr>
       <w:r>
         <w:t xml:space="preserve">Los mantenedores de Paciente y Medico solo requieren alta y listado básico (nombre y datos de contacto), para poder asociarlos a una nota clínica.</w:t>
+      </w:r>
+    </w:p>
+    <w:p>
+      <w:pPr>
+        <w:pStyle w:val="Heading2"/>
+        <w:spacing w:after="100" w:before="220"/>
+      </w:pPr>
+      <w:r>
+        <w:t xml:space="preserve">Controles ISO/IEC 27001 aplicados</w:t>
+      </w:r>
+    </w:p>
+    <w:tbl>
+      <w:tblPr>
+        <w:tblW w:type="dxa" w:w="9000"/>
+        <w:tblBorders>
+          <w:top w:val="single" w:color="auto" w:sz="4"/>
+          <w:left w:val="single" w:color="auto" w:sz="4"/>
+          <w:bottom w:val="single" w:color="auto" w:sz="4"/>
+          <w:right w:val="single" w:color="auto" w:sz="4"/>
+          <w:insideH w:val="single" w:color="auto" w:sz="4"/>
+          <w:insideV w:val="single" w:color="auto" w:sz="4"/>
+        </w:tblBorders>
+      </w:tblPr>
+      <w:tblGrid>
+        <w:gridCol w:w="2400"/>
+        <w:gridCol w:w="4700"/>
+        <w:gridCol w:w="1900"/>
+      </w:tblGrid>
+      <w:tr>
+        <w:tc>
+          <w:tcPr>
+            <w:tcW w:type="dxa" w:w="2400"/>
+            <w:shd w:fill="D9E2F3" w:val="clear"/>
+          </w:tcPr>
+          <w:p>
+            <w:r>
+              <w:rPr>
+                <w:b/>
+                <w:bCs/>
+                <w:sz w:val="19"/>
+                <w:szCs w:val="19"/>
+              </w:rPr>
+              <w:t xml:space="preserve">Control</w:t>
+            </w:r>
+          </w:p>
+        </w:tc>
+        <w:tc>
+          <w:tcPr>
+            <w:tcW w:type="dxa" w:w="4700"/>
+            <w:shd w:fill="D9E2F3" w:val="clear"/>
+          </w:tcPr>
+          <w:p>
+            <w:r>
+              <w:rPr>
+                <w:b/>
+                <w:bCs/>
+                <w:sz w:val="19"/>
+                <w:szCs w:val="19"/>
+              </w:rPr>
+              <w:t xml:space="preserve">Descripción</w:t>
+            </w:r>
+          </w:p>
+        </w:tc>
+        <w:tc>
+          <w:tcPr>
+            <w:tcW w:type="dxa" w:w="1900"/>
+            <w:shd w:fill="D9E2F3" w:val="clear"/>
+          </w:tcPr>
+          <w:p>
+            <w:r>
+              <w:rPr>
+                <w:b/>
+                <w:bCs/>
+                <w:sz w:val="19"/>
+                <w:szCs w:val="19"/>
+              </w:rPr>
+              <w:t xml:space="preserve">Dónde se aplica</w:t>
+            </w:r>
+          </w:p>
+        </w:tc>
+      </w:tr>
+      <w:tr>
+        <w:tc>
+          <w:tcPr>
+            <w:tcW w:type="dxa" w:w="2400"/>
+          </w:tcPr>
+          <w:p>
+            <w:r>
+              <w:rPr>
+                <w:b w:val="false"/>
+                <w:bCs w:val="false"/>
+                <w:sz w:val="19"/>
+                <w:szCs w:val="19"/>
+              </w:rPr>
+              <w:t xml:space="preserve">A.8.28 Codificación segura</w:t>
+            </w:r>
+          </w:p>
+        </w:tc>
+        <w:tc>
+          <w:tcPr>
+            <w:tcW w:type="dxa" w:w="4700"/>
+          </w:tcPr>
+          <w:p>
+            <w:r>
+              <w:rPr>
+                <w:b w:val="false"/>
+                <w:bCs w:val="false"/>
+                <w:sz w:val="19"/>
+                <w:szCs w:val="19"/>
+              </w:rPr>
+              <w:t xml:space="preserve">Validación de campos obligatorios y acceso a datos exclusivamente vía Stored Procedures con parámetros tipados (sin SQL concatenado).</w:t>
+            </w:r>
+          </w:p>
+        </w:tc>
+        <w:tc>
+          <w:tcPr>
+            <w:tcW w:type="dxa" w:w="1900"/>
+          </w:tcPr>
+          <w:p>
+            <w:r>
+              <w:rPr>
+                <w:b w:val="false"/>
+                <w:bCs w:val="false"/>
+                <w:sz w:val="19"/>
+                <w:szCs w:val="19"/>
+              </w:rPr>
+              <w:t xml:space="preserve">RF-01 Crear, RF-03 Editar</w:t>
+            </w:r>
+          </w:p>
+        </w:tc>
+      </w:tr>
+      <w:tr>
+        <w:tc>
+          <w:tcPr>
+            <w:tcW w:type="dxa" w:w="2400"/>
+          </w:tcPr>
+          <w:p>
+            <w:r>
+              <w:rPr>
+                <w:b w:val="false"/>
+                <w:bCs w:val="false"/>
+                <w:sz w:val="19"/>
+                <w:szCs w:val="19"/>
+              </w:rPr>
+              <w:t xml:space="preserve">A.5.33 Protección de registros</w:t>
+            </w:r>
+          </w:p>
+        </w:tc>
+        <w:tc>
+          <w:tcPr>
+            <w:tcW w:type="dxa" w:w="4700"/>
+          </w:tcPr>
+          <w:p>
+            <w:r>
+              <w:rPr>
+                <w:b w:val="false"/>
+                <w:bCs w:val="false"/>
+                <w:sz w:val="19"/>
+                <w:szCs w:val="19"/>
+              </w:rPr>
+              <w:t xml:space="preserve">Una nota FIRMADA es inmutable: el procedimiento almacenado rechaza el UPDATE con RAISERROR si el estado no es BORRADOR.</w:t>
+            </w:r>
+          </w:p>
+        </w:tc>
+        <w:tc>
+          <w:tcPr>
+            <w:tcW w:type="dxa" w:w="1900"/>
+          </w:tcPr>
+          <w:p>
+            <w:r>
+              <w:rPr>
+                <w:b w:val="false"/>
+                <w:bCs w:val="false"/>
+                <w:sz w:val="19"/>
+                <w:szCs w:val="19"/>
+              </w:rPr>
+              <w:t xml:space="preserve">RF-05 Firmar</w:t>
+            </w:r>
+          </w:p>
+        </w:tc>
+      </w:tr>
+    </w:tbl>
+    <w:p>
+      <w:pPr>
+        <w:spacing w:after="80"/>
+      </w:pPr>
+    </w:p>
+    <w:p>
+      <w:pPr>
+        <w:spacing w:after="120"/>
+      </w:pPr>
+      <w:r>
+        <w:t xml:space="preserve">Pendiente para una fase posterior: control de acceso por rol (A.5.15), autenticación de sesión (A.5.17) y registro de auditoría (A.8.15), cuando se incorporen usuarios y roles.</w:t>
       </w:r>
     </w:p>
     <w:p>

</xml_diff>